<commit_message>
Update RB V2022.1.000 Change Notes-SF.docx
Updated change notes to include last minute revisions to the ALT-02, NCB-01, and MCH-01b.
</commit_message>
<xml_diff>
--- a/2022/Revision Batch/V2022.1.000/RB V2022.1.000 Change Notes-SF.docx
+++ b/2022/Revision Batch/V2022.1.000/RB V2022.1.000 Change Notes-SF.docx
@@ -256,12 +256,24 @@
         </w:numPr>
         <w:spacing w:after="0"/>
         <w:rPr>
+          <w:ins w:id="0" w:author="Shewmaker, Michael@Energy" w:date="2022-12-19T08:23:00Z"/>
           <w:rFonts w:eastAsiaTheme="minorEastAsia"/>
           <w:b/>
           <w:bCs/>
           <w:color w:val="24292F"/>
           <w:sz w:val="21"/>
           <w:szCs w:val="21"/>
+          <w:rPrChange w:id="1" w:author="Shewmaker, Michael@Energy" w:date="2022-12-19T08:23:00Z">
+            <w:rPr>
+              <w:ins w:id="2" w:author="Shewmaker, Michael@Energy" w:date="2022-12-19T08:23:00Z"/>
+              <w:rFonts w:eastAsia="Segoe UI"/>
+              <w:b/>
+              <w:bCs/>
+              <w:color w:val="24292F"/>
+              <w:sz w:val="21"/>
+              <w:szCs w:val="21"/>
+            </w:rPr>
+          </w:rPrChange>
         </w:rPr>
       </w:pPr>
       <w:r>
@@ -331,14 +343,313 @@
     </w:p>
     <w:p>
       <w:pPr>
-        <w:spacing w:after="0"/>
-        <w:rPr>
-          <w:rFonts w:eastAsia="Segoe UI" w:cstheme="minorHAnsi"/>
-          <w:b/>
-          <w:bCs/>
+        <w:pStyle w:val="ListParagraph"/>
+        <w:numPr>
+          <w:ilvl w:val="0"/>
+          <w:numId w:val="3"/>
+        </w:numPr>
+        <w:spacing w:after="0"/>
+        <w:rPr>
+          <w:ins w:id="3" w:author="Shewmaker, Michael@Energy" w:date="2022-12-19T08:24:00Z"/>
+          <w:rFonts w:eastAsiaTheme="minorEastAsia"/>
           <w:color w:val="24292F"/>
           <w:sz w:val="21"/>
           <w:szCs w:val="21"/>
+          <w:rPrChange w:id="4" w:author="Shewmaker, Michael@Energy" w:date="2022-12-19T08:24:00Z">
+            <w:rPr>
+              <w:ins w:id="5" w:author="Shewmaker, Michael@Energy" w:date="2022-12-19T08:24:00Z"/>
+              <w:rFonts w:eastAsiaTheme="minorEastAsia"/>
+              <w:b/>
+              <w:bCs/>
+              <w:color w:val="24292F"/>
+              <w:sz w:val="21"/>
+              <w:szCs w:val="21"/>
+            </w:rPr>
+          </w:rPrChange>
+        </w:rPr>
+      </w:pPr>
+      <w:ins w:id="6" w:author="Shewmaker, Michael@Energy" w:date="2022-12-19T08:23:00Z">
+        <w:r>
+          <w:rPr>
+            <w:rFonts w:eastAsiaTheme="minorEastAsia"/>
+            <w:color w:val="24292F"/>
+            <w:sz w:val="21"/>
+            <w:szCs w:val="21"/>
+            <w:rPrChange w:id="7" w:author="Shewmaker, Michael@Energy" w:date="2022-12-19T08:24:00Z">
+              <w:rPr>
+                <w:rFonts w:eastAsiaTheme="minorEastAsia"/>
+                <w:b/>
+                <w:bCs/>
+                <w:color w:val="24292F"/>
+                <w:sz w:val="21"/>
+                <w:szCs w:val="21"/>
+              </w:rPr>
+            </w:rPrChange>
+          </w:rPr>
+          <w:t xml:space="preserve">D10, E10, and F10 </w:t>
+        </w:r>
+      </w:ins>
+      <w:ins w:id="8" w:author="Shewmaker, Michael@Energy" w:date="2022-12-19T08:24:00Z">
+        <w:r>
+          <w:rPr>
+            <w:rFonts w:eastAsiaTheme="minorEastAsia"/>
+            <w:color w:val="24292F"/>
+            <w:sz w:val="21"/>
+            <w:szCs w:val="21"/>
+            <w:rPrChange w:id="9" w:author="Shewmaker, Michael@Energy" w:date="2022-12-19T08:24:00Z">
+              <w:rPr>
+                <w:rFonts w:eastAsiaTheme="minorEastAsia"/>
+                <w:b/>
+                <w:bCs/>
+                <w:color w:val="24292F"/>
+                <w:sz w:val="21"/>
+                <w:szCs w:val="21"/>
+              </w:rPr>
+            </w:rPrChange>
+          </w:rPr>
+          <w:t>–</w:t>
+        </w:r>
+      </w:ins>
+      <w:ins w:id="10" w:author="Shewmaker, Michael@Energy" w:date="2022-12-19T08:23:00Z">
+        <w:r>
+          <w:rPr>
+            <w:rFonts w:eastAsiaTheme="minorEastAsia"/>
+            <w:color w:val="24292F"/>
+            <w:sz w:val="21"/>
+            <w:szCs w:val="21"/>
+            <w:rPrChange w:id="11" w:author="Shewmaker, Michael@Energy" w:date="2022-12-19T08:24:00Z">
+              <w:rPr>
+                <w:rFonts w:eastAsiaTheme="minorEastAsia"/>
+                <w:b/>
+                <w:bCs/>
+                <w:color w:val="24292F"/>
+                <w:sz w:val="21"/>
+                <w:szCs w:val="21"/>
+              </w:rPr>
+            </w:rPrChange>
+          </w:rPr>
+          <w:t xml:space="preserve"> </w:t>
+        </w:r>
+      </w:ins>
+      <w:ins w:id="12" w:author="Shewmaker, Michael@Energy" w:date="2022-12-19T08:24:00Z">
+        <w:r>
+          <w:rPr>
+            <w:rFonts w:eastAsiaTheme="minorEastAsia"/>
+            <w:color w:val="24292F"/>
+            <w:sz w:val="21"/>
+            <w:szCs w:val="21"/>
+            <w:rPrChange w:id="13" w:author="Shewmaker, Michael@Energy" w:date="2022-12-19T08:24:00Z">
+              <w:rPr>
+                <w:rFonts w:eastAsiaTheme="minorEastAsia"/>
+                <w:b/>
+                <w:bCs/>
+                <w:color w:val="24292F"/>
+                <w:sz w:val="21"/>
+                <w:szCs w:val="21"/>
+              </w:rPr>
+            </w:rPrChange>
+          </w:rPr>
+          <w:t>revised field name</w:t>
+        </w:r>
+      </w:ins>
+    </w:p>
+    <w:p>
+      <w:pPr>
+        <w:pStyle w:val="ListParagraph"/>
+        <w:numPr>
+          <w:ilvl w:val="1"/>
+          <w:numId w:val="3"/>
+        </w:numPr>
+        <w:spacing w:after="0"/>
+        <w:rPr>
+          <w:ins w:id="14" w:author="Shewmaker, Michael@Energy" w:date="2022-12-19T08:23:00Z"/>
+          <w:rFonts w:eastAsiaTheme="minorEastAsia"/>
+          <w:b/>
+          <w:bCs/>
+          <w:color w:val="24292F"/>
+          <w:sz w:val="21"/>
+          <w:szCs w:val="21"/>
+          <w:rPrChange w:id="15" w:author="Shewmaker, Michael@Energy" w:date="2022-12-19T08:23:00Z">
+            <w:rPr>
+              <w:ins w:id="16" w:author="Shewmaker, Michael@Energy" w:date="2022-12-19T08:23:00Z"/>
+              <w:rFonts w:eastAsia="Segoe UI"/>
+              <w:b/>
+              <w:bCs/>
+              <w:color w:val="24292F"/>
+              <w:sz w:val="21"/>
+              <w:szCs w:val="21"/>
+            </w:rPr>
+          </w:rPrChange>
+        </w:rPr>
+        <w:pPrChange w:id="17" w:author="Shewmaker, Michael@Energy" w:date="2022-12-19T08:24:00Z">
+          <w:pPr>
+            <w:pStyle w:val="ListParagraph"/>
+            <w:numPr>
+              <w:numId w:val="3"/>
+            </w:numPr>
+            <w:spacing w:after="0"/>
+            <w:ind w:hanging="360"/>
+          </w:pPr>
+        </w:pPrChange>
+      </w:pPr>
+      <w:ins w:id="18" w:author="Shewmaker, Michael@Energy" w:date="2022-12-19T08:24:00Z">
+        <w:r>
+          <w:rPr>
+            <w:rFonts w:eastAsiaTheme="minorEastAsia"/>
+            <w:color w:val="24292F"/>
+            <w:sz w:val="21"/>
+            <w:szCs w:val="21"/>
+            <w:rPrChange w:id="19" w:author="Shewmaker, Michael@Energy" w:date="2022-12-19T08:24:00Z">
+              <w:rPr>
+                <w:rFonts w:eastAsiaTheme="minorEastAsia"/>
+                <w:b/>
+                <w:bCs/>
+                <w:color w:val="24292F"/>
+                <w:sz w:val="21"/>
+                <w:szCs w:val="21"/>
+              </w:rPr>
+            </w:rPrChange>
+          </w:rPr>
+          <w:t xml:space="preserve">Cooling Minimum Efficiency Value </w:t>
+        </w:r>
+        <w:r>
+          <w:rPr>
+            <w:rFonts w:eastAsiaTheme="minorEastAsia"/>
+            <w:b/>
+            <w:bCs/>
+            <w:color w:val="24292F"/>
+            <w:sz w:val="21"/>
+            <w:szCs w:val="21"/>
+          </w:rPr>
+          <w:t>SEER/SEER2</w:t>
+        </w:r>
+      </w:ins>
+    </w:p>
+    <w:p>
+      <w:pPr>
+        <w:pStyle w:val="ListParagraph"/>
+        <w:numPr>
+          <w:ilvl w:val="0"/>
+          <w:numId w:val="3"/>
+        </w:numPr>
+        <w:spacing w:after="0"/>
+        <w:rPr>
+          <w:ins w:id="20" w:author="Shewmaker, Michael@Energy" w:date="2022-12-19T08:23:00Z"/>
+          <w:rFonts w:eastAsiaTheme="minorEastAsia"/>
+          <w:color w:val="24292F"/>
+          <w:sz w:val="21"/>
+          <w:szCs w:val="21"/>
+          <w:rPrChange w:id="21" w:author="Shewmaker, Michael@Energy" w:date="2022-12-19T08:24:00Z">
+            <w:rPr>
+              <w:ins w:id="22" w:author="Shewmaker, Michael@Energy" w:date="2022-12-19T08:23:00Z"/>
+              <w:rFonts w:eastAsia="Segoe UI"/>
+              <w:b/>
+              <w:bCs/>
+              <w:color w:val="24292F"/>
+              <w:sz w:val="21"/>
+              <w:szCs w:val="21"/>
+            </w:rPr>
+          </w:rPrChange>
+        </w:rPr>
+      </w:pPr>
+      <w:ins w:id="23" w:author="Shewmaker, Michael@Energy" w:date="2022-12-19T08:23:00Z">
+        <w:r>
+          <w:rPr>
+            <w:rFonts w:eastAsia="Segoe UI"/>
+            <w:color w:val="24292F"/>
+            <w:sz w:val="21"/>
+            <w:szCs w:val="21"/>
+            <w:rPrChange w:id="24" w:author="Shewmaker, Michael@Energy" w:date="2022-12-19T08:24:00Z">
+              <w:rPr>
+                <w:rFonts w:eastAsia="Segoe UI"/>
+                <w:b/>
+                <w:bCs/>
+                <w:color w:val="24292F"/>
+                <w:sz w:val="21"/>
+                <w:szCs w:val="21"/>
+              </w:rPr>
+            </w:rPrChange>
+          </w:rPr>
+          <w:t>D10b, E10b, and F10b – added new fields</w:t>
+        </w:r>
+      </w:ins>
+    </w:p>
+    <w:p>
+      <w:pPr>
+        <w:pStyle w:val="ListParagraph"/>
+        <w:numPr>
+          <w:ilvl w:val="1"/>
+          <w:numId w:val="3"/>
+        </w:numPr>
+        <w:spacing w:after="0"/>
+        <w:rPr>
+          <w:rFonts w:eastAsiaTheme="minorEastAsia"/>
+          <w:color w:val="24292F"/>
+          <w:sz w:val="21"/>
+          <w:szCs w:val="21"/>
+          <w:rPrChange w:id="25" w:author="Shewmaker, Michael@Energy" w:date="2022-12-19T08:24:00Z">
+            <w:rPr>
+              <w:rFonts w:eastAsiaTheme="minorEastAsia"/>
+              <w:b/>
+              <w:bCs/>
+              <w:color w:val="24292F"/>
+              <w:sz w:val="21"/>
+              <w:szCs w:val="21"/>
+            </w:rPr>
+          </w:rPrChange>
+        </w:rPr>
+      </w:pPr>
+      <w:ins w:id="26" w:author="Shewmaker, Michael@Energy" w:date="2022-12-19T08:23:00Z">
+        <w:r>
+          <w:rPr>
+            <w:rFonts w:eastAsia="Segoe UI"/>
+            <w:color w:val="24292F"/>
+            <w:sz w:val="21"/>
+            <w:szCs w:val="21"/>
+            <w:rPrChange w:id="27" w:author="Shewmaker, Michael@Energy" w:date="2022-12-19T08:24:00Z">
+              <w:rPr>
+                <w:rFonts w:eastAsia="Segoe UI"/>
+                <w:b/>
+                <w:bCs/>
+                <w:color w:val="24292F"/>
+                <w:sz w:val="21"/>
+                <w:szCs w:val="21"/>
+              </w:rPr>
+            </w:rPrChange>
+          </w:rPr>
+          <w:t>Cooling Minimum Efficiency Val</w:t>
+        </w:r>
+        <w:r>
+          <w:rPr>
+            <w:rFonts w:eastAsia="Segoe UI"/>
+            <w:color w:val="24292F"/>
+            <w:sz w:val="21"/>
+            <w:szCs w:val="21"/>
+            <w:rPrChange w:id="28" w:author="Shewmaker, Michael@Energy" w:date="2022-12-19T08:24:00Z">
+              <w:rPr>
+                <w:rFonts w:eastAsia="Segoe UI"/>
+                <w:b/>
+                <w:bCs/>
+                <w:color w:val="24292F"/>
+                <w:sz w:val="21"/>
+                <w:szCs w:val="21"/>
+              </w:rPr>
+            </w:rPrChange>
+          </w:rPr>
+          <w:t>ue EER/EER2/CEER</w:t>
+        </w:r>
+      </w:ins>
+    </w:p>
+    <w:p>
+      <w:pPr>
+        <w:spacing w:after="0"/>
+        <w:rPr>
+          <w:rFonts w:eastAsia="Segoe UI" w:cstheme="minorHAnsi"/>
+          <w:b/>
+          <w:bCs/>
+          <w:color w:val="24292F"/>
+          <w:sz w:val="21"/>
+          <w:szCs w:val="21"/>
         </w:rPr>
       </w:pPr>
     </w:p>
@@ -386,7 +697,7 @@
       <w:r>
         <w:t>" option</w:t>
       </w:r>
-      <w:ins w:id="0" w:author="Shewmaker, Michael@Energy" w:date="2022-11-03T17:08:00Z">
+      <w:ins w:id="29" w:author="Shewmaker, Michael@Energy" w:date="2022-11-03T17:08:00Z">
         <w:r>
           <w:t xml:space="preserve"> </w:t>
         </w:r>
@@ -467,7 +778,7 @@
       <w:r>
         <w:t>.</w:t>
       </w:r>
-      <w:ins w:id="1" w:author="Shewmaker, Michael@Energy" w:date="2022-11-03T17:08:00Z">
+      <w:ins w:id="30" w:author="Shewmaker, Michael@Energy" w:date="2022-11-03T17:08:00Z">
         <w:r>
           <w:t xml:space="preserve"> </w:t>
         </w:r>
@@ -555,7 +866,7 @@
       <w:r>
         <w:t>.</w:t>
       </w:r>
-      <w:ins w:id="2" w:author="Shewmaker, Michael@Energy" w:date="2022-11-03T17:08:00Z">
+      <w:ins w:id="31" w:author="Shewmaker, Michael@Energy" w:date="2022-11-03T17:08:00Z">
         <w:r>
           <w:t xml:space="preserve"> </w:t>
         </w:r>
@@ -613,25 +924,7 @@
           <w:b/>
           <w:bCs/>
         </w:rPr>
-        <w:t xml:space="preserve">A single </w:t>
-      </w:r>
-      <w:proofErr w:type="gramStart"/>
-      <w:r>
-        <w:rPr>
-          <w:rFonts w:cstheme="minorHAnsi"/>
-          <w:b/>
-          <w:bCs/>
-        </w:rPr>
-        <w:t>240 volt</w:t>
-      </w:r>
-      <w:proofErr w:type="gramEnd"/>
-      <w:r>
-        <w:rPr>
-          <w:rFonts w:cstheme="minorHAnsi"/>
-          <w:b/>
-          <w:bCs/>
-        </w:rPr>
-        <w:t xml:space="preserve"> heat pump water heater (HPWH).   Installed in conditioned space or garage. </w:t>
+        <w:t xml:space="preserve">A single 240 volt heat pump water heater (HPWH).   Installed in conditioned space or garage. </w:t>
       </w:r>
     </w:p>
     <w:p>
@@ -704,7 +997,7 @@
         </w:rPr>
         <w:t>K06 – revised pseudo code</w:t>
       </w:r>
-      <w:ins w:id="3" w:author="Shewmaker, Michael@Energy" w:date="2022-11-03T17:09:00Z">
+      <w:ins w:id="32" w:author="Shewmaker, Michael@Energy" w:date="2022-11-03T17:09:00Z">
         <w:r>
           <w:rPr>
             <w:rFonts w:eastAsia="Segoe UI"/>
@@ -738,9 +1031,21 @@
         </w:numPr>
         <w:spacing w:after="0"/>
         <w:rPr>
+          <w:ins w:id="33" w:author="Shewmaker, Michael@Energy" w:date="2022-12-19T08:24:00Z"/>
           <w:color w:val="24292F"/>
           <w:sz w:val="21"/>
           <w:szCs w:val="21"/>
+          <w:rPrChange w:id="34" w:author="Shewmaker, Michael@Energy" w:date="2022-12-19T08:24:00Z">
+            <w:rPr>
+              <w:ins w:id="35" w:author="Shewmaker, Michael@Energy" w:date="2022-12-19T08:24:00Z"/>
+              <w:rFonts w:eastAsia="Segoe UI"/>
+              <w:b/>
+              <w:bCs/>
+              <w:color w:val="24292F"/>
+              <w:sz w:val="21"/>
+              <w:szCs w:val="21"/>
+            </w:rPr>
+          </w:rPrChange>
         </w:rPr>
       </w:pPr>
       <w:r>
@@ -810,14 +1115,183 @@
     </w:p>
     <w:p>
       <w:pPr>
-        <w:spacing w:after="0"/>
-        <w:rPr>
-          <w:rFonts w:eastAsia="Segoe UI" w:cstheme="minorHAnsi"/>
-          <w:b/>
-          <w:bCs/>
+        <w:pStyle w:val="ListParagraph"/>
+        <w:numPr>
+          <w:ilvl w:val="0"/>
+          <w:numId w:val="3"/>
+        </w:numPr>
+        <w:spacing w:after="0"/>
+        <w:rPr>
+          <w:ins w:id="36" w:author="Shewmaker, Michael@Energy" w:date="2022-12-19T08:24:00Z"/>
           <w:color w:val="24292F"/>
           <w:sz w:val="21"/>
           <w:szCs w:val="21"/>
+          <w:rPrChange w:id="37" w:author="Shewmaker, Michael@Energy" w:date="2022-12-19T08:25:00Z">
+            <w:rPr>
+              <w:ins w:id="38" w:author="Shewmaker, Michael@Energy" w:date="2022-12-19T08:24:00Z"/>
+              <w:rFonts w:eastAsia="Segoe UI"/>
+              <w:b/>
+              <w:bCs/>
+              <w:color w:val="24292F"/>
+              <w:sz w:val="21"/>
+              <w:szCs w:val="21"/>
+            </w:rPr>
+          </w:rPrChange>
+        </w:rPr>
+      </w:pPr>
+      <w:ins w:id="39" w:author="Shewmaker, Michael@Energy" w:date="2022-12-19T08:24:00Z">
+        <w:r>
+          <w:rPr>
+            <w:rFonts w:eastAsia="Segoe UI"/>
+            <w:color w:val="24292F"/>
+            <w:sz w:val="21"/>
+            <w:szCs w:val="21"/>
+            <w:rPrChange w:id="40" w:author="Shewmaker, Michael@Energy" w:date="2022-12-19T08:25:00Z">
+              <w:rPr>
+                <w:rFonts w:eastAsia="Segoe UI"/>
+                <w:b/>
+                <w:bCs/>
+                <w:color w:val="24292F"/>
+                <w:sz w:val="21"/>
+                <w:szCs w:val="21"/>
+              </w:rPr>
+            </w:rPrChange>
+          </w:rPr>
+          <w:t>K07 – revised field name</w:t>
+        </w:r>
+      </w:ins>
+    </w:p>
+    <w:p>
+      <w:pPr>
+        <w:pStyle w:val="ListParagraph"/>
+        <w:numPr>
+          <w:ilvl w:val="1"/>
+          <w:numId w:val="3"/>
+        </w:numPr>
+        <w:spacing w:after="0"/>
+        <w:rPr>
+          <w:ins w:id="41" w:author="Shewmaker, Michael@Energy" w:date="2022-12-19T08:25:00Z"/>
+          <w:color w:val="24292F"/>
+          <w:sz w:val="21"/>
+          <w:szCs w:val="21"/>
+          <w:rPrChange w:id="42" w:author="Shewmaker, Michael@Energy" w:date="2022-12-19T08:25:00Z">
+            <w:rPr>
+              <w:ins w:id="43" w:author="Shewmaker, Michael@Energy" w:date="2022-12-19T08:25:00Z"/>
+              <w:rFonts w:eastAsia="Segoe UI"/>
+              <w:color w:val="24292F"/>
+              <w:sz w:val="21"/>
+              <w:szCs w:val="21"/>
+            </w:rPr>
+          </w:rPrChange>
+        </w:rPr>
+      </w:pPr>
+      <w:ins w:id="44" w:author="Shewmaker, Michael@Energy" w:date="2022-12-19T08:24:00Z">
+        <w:r>
+          <w:rPr>
+            <w:rFonts w:eastAsia="Segoe UI"/>
+            <w:color w:val="24292F"/>
+            <w:sz w:val="21"/>
+            <w:szCs w:val="21"/>
+            <w:rPrChange w:id="45" w:author="Shewmaker, Michael@Energy" w:date="2022-12-19T08:25:00Z">
+              <w:rPr>
+                <w:rFonts w:eastAsia="Segoe UI"/>
+                <w:b/>
+                <w:bCs/>
+                <w:color w:val="24292F"/>
+                <w:sz w:val="21"/>
+                <w:szCs w:val="21"/>
+              </w:rPr>
+            </w:rPrChange>
+          </w:rPr>
+          <w:t xml:space="preserve">Proposed Cooling Efficiency </w:t>
+        </w:r>
+        <w:r>
+          <w:rPr>
+            <w:rFonts w:eastAsia="Segoe UI"/>
+            <w:b/>
+            <w:bCs/>
+            <w:color w:val="24292F"/>
+            <w:sz w:val="21"/>
+            <w:szCs w:val="21"/>
+          </w:rPr>
+          <w:t>SEER/</w:t>
+        </w:r>
+      </w:ins>
+      <w:ins w:id="46" w:author="Shewmaker, Michael@Energy" w:date="2022-12-19T08:25:00Z">
+        <w:r>
+          <w:rPr>
+            <w:rFonts w:eastAsia="Segoe UI"/>
+            <w:b/>
+            <w:bCs/>
+            <w:color w:val="24292F"/>
+            <w:sz w:val="21"/>
+            <w:szCs w:val="21"/>
+          </w:rPr>
+          <w:t>SEER2</w:t>
+        </w:r>
+      </w:ins>
+    </w:p>
+    <w:p>
+      <w:pPr>
+        <w:pStyle w:val="ListParagraph"/>
+        <w:numPr>
+          <w:ilvl w:val="0"/>
+          <w:numId w:val="3"/>
+        </w:numPr>
+        <w:spacing w:after="0"/>
+        <w:rPr>
+          <w:ins w:id="47" w:author="Shewmaker, Michael@Energy" w:date="2022-12-19T08:25:00Z"/>
+          <w:color w:val="24292F"/>
+          <w:sz w:val="21"/>
+          <w:szCs w:val="21"/>
+        </w:rPr>
+      </w:pPr>
+      <w:ins w:id="48" w:author="Shewmaker, Michael@Energy" w:date="2022-12-19T08:25:00Z">
+        <w:r>
+          <w:rPr>
+            <w:color w:val="24292F"/>
+            <w:sz w:val="21"/>
+            <w:szCs w:val="21"/>
+          </w:rPr>
+          <w:t>K07b – added new field</w:t>
+        </w:r>
+      </w:ins>
+    </w:p>
+    <w:p>
+      <w:pPr>
+        <w:pStyle w:val="ListParagraph"/>
+        <w:numPr>
+          <w:ilvl w:val="1"/>
+          <w:numId w:val="3"/>
+        </w:numPr>
+        <w:spacing w:after="0"/>
+        <w:rPr>
+          <w:color w:val="24292F"/>
+          <w:sz w:val="21"/>
+          <w:szCs w:val="21"/>
+        </w:rPr>
+      </w:pPr>
+      <w:ins w:id="49" w:author="Shewmaker, Michael@Energy" w:date="2022-12-19T08:25:00Z">
+        <w:r>
+          <w:rPr>
+            <w:color w:val="24292F"/>
+            <w:sz w:val="21"/>
+            <w:szCs w:val="21"/>
+          </w:rPr>
+          <w:t>Proposed Cooling Efficiency EER/EER2/CEER</w:t>
+        </w:r>
+      </w:ins>
+    </w:p>
+    <w:p>
+      <w:pPr>
+        <w:spacing w:after="0"/>
+        <w:rPr>
+          <w:rFonts w:eastAsia="Segoe UI" w:cstheme="minorHAnsi"/>
+          <w:b/>
+          <w:bCs/>
+          <w:color w:val="24292F"/>
+          <w:sz w:val="21"/>
+          <w:szCs w:val="21"/>
         </w:rPr>
       </w:pPr>
     </w:p>
@@ -875,7 +1349,7 @@
         <w:t>None</w:t>
       </w:r>
       <w:proofErr w:type="gramEnd"/>
-      <w:ins w:id="4" w:author="Shewmaker, Michael@Energy" w:date="2022-11-03T17:09:00Z">
+      <w:ins w:id="50" w:author="Shewmaker, Michael@Energy" w:date="2022-11-03T17:09:00Z">
         <w:r>
           <w:rPr>
             <w:b/>
@@ -991,7 +1465,7 @@
           <w:u w:val="single"/>
         </w:rPr>
       </w:pPr>
-      <w:bookmarkStart w:id="5" w:name="_Hlk103953246"/>
+      <w:bookmarkStart w:id="51" w:name="_Hlk103953246"/>
       <w:r>
         <w:rPr>
           <w:u w:val="single"/>
@@ -1029,7 +1503,7 @@
         </w:rPr>
         <w:t>/CEER</w:t>
       </w:r>
-      <w:ins w:id="6" w:author="Shewmaker, Michael@Energy" w:date="2022-11-03T17:09:00Z">
+      <w:ins w:id="52" w:author="Shewmaker, Michael@Energy" w:date="2022-11-03T17:09:00Z">
         <w:r>
           <w:rPr>
             <w:b/>
@@ -1076,7 +1550,7 @@
       <w:r>
         <w:t xml:space="preserve"> </w:t>
       </w:r>
-      <w:ins w:id="7" w:author="Shewmaker, Michael@Energy" w:date="2022-11-03T17:10:00Z">
+      <w:ins w:id="53" w:author="Shewmaker, Michael@Energy" w:date="2022-11-03T17:10:00Z">
         <w:r>
           <w:rPr>
             <w:rStyle w:val="normaltextrun"/>
@@ -1103,7 +1577,7 @@
       <w:r>
         <w:t>Allow NA</w:t>
       </w:r>
-      <w:ins w:id="8" w:author="Shewmaker, Michael@Energy" w:date="2022-11-03T17:10:00Z">
+      <w:ins w:id="54" w:author="Shewmaker, Michael@Energy" w:date="2022-11-03T17:10:00Z">
         <w:r>
           <w:t xml:space="preserve"> </w:t>
         </w:r>
@@ -1314,7 +1788,7 @@
         <w:t>b</w:t>
       </w:r>
     </w:p>
-    <w:bookmarkEnd w:id="5"/>
+    <w:bookmarkEnd w:id="51"/>
     <w:p>
       <w:pPr>
         <w:pStyle w:val="ListParagraph"/>
@@ -1352,7 +1826,6 @@
         </w:rPr>
       </w:pPr>
       <w:r>
-        <w:lastRenderedPageBreak/>
         <w:t xml:space="preserve">AFUE = </w:t>
       </w:r>
       <w:r>
@@ -1443,7 +1916,7 @@
           <w:bCs/>
         </w:rPr>
       </w:pPr>
-      <w:bookmarkStart w:id="9" w:name="_Hlk114849335"/>
+      <w:bookmarkStart w:id="55" w:name="_Hlk114849335"/>
       <w:r>
         <w:t>C</w:t>
       </w:r>
@@ -1492,6 +1965,7 @@
         </w:numPr>
         <w:spacing w:after="0"/>
         <w:rPr>
+          <w:ins w:id="56" w:author="Shewmaker, Michael@Energy" w:date="2022-12-19T08:25:00Z"/>
           <w:rFonts w:cstheme="minorHAnsi"/>
           <w:bCs/>
         </w:rPr>
@@ -1519,7 +1993,111 @@
         <w:t>instead of SEER/EER, SEER2/EER2</w:t>
       </w:r>
     </w:p>
-    <w:bookmarkEnd w:id="9"/>
+    <w:p>
+      <w:pPr>
+        <w:numPr>
+          <w:ilvl w:val="0"/>
+          <w:numId w:val="22"/>
+        </w:numPr>
+        <w:spacing w:after="0"/>
+        <w:rPr>
+          <w:ins w:id="57" w:author="Shewmaker, Michael@Energy" w:date="2022-12-19T08:25:00Z"/>
+          <w:rFonts w:cstheme="minorHAnsi"/>
+          <w:bCs/>
+        </w:rPr>
+      </w:pPr>
+      <w:ins w:id="58" w:author="Shewmaker, Michael@Energy" w:date="2022-12-19T08:25:00Z">
+        <w:r>
+          <w:rPr>
+            <w:rFonts w:cstheme="minorHAnsi"/>
+            <w:bCs/>
+          </w:rPr>
+          <w:t>E04 – revised field name</w:t>
+        </w:r>
+      </w:ins>
+    </w:p>
+    <w:p>
+      <w:pPr>
+        <w:numPr>
+          <w:ilvl w:val="1"/>
+          <w:numId w:val="22"/>
+        </w:numPr>
+        <w:spacing w:after="0"/>
+        <w:rPr>
+          <w:ins w:id="59" w:author="Shewmaker, Michael@Energy" w:date="2022-12-19T08:26:00Z"/>
+          <w:rFonts w:cstheme="minorHAnsi"/>
+          <w:bCs/>
+        </w:rPr>
+      </w:pPr>
+      <w:ins w:id="60" w:author="Shewmaker, Michael@Energy" w:date="2022-12-19T08:25:00Z">
+        <w:r>
+          <w:rPr>
+            <w:rFonts w:cstheme="minorHAnsi"/>
+            <w:bCs/>
+          </w:rPr>
+          <w:t xml:space="preserve">Cooling Efficiency Value </w:t>
+        </w:r>
+        <w:r>
+          <w:rPr>
+            <w:rFonts w:cstheme="minorHAnsi"/>
+            <w:b/>
+            <w:rPrChange w:id="61" w:author="Shewmaker, Michael@Energy" w:date="2022-12-19T08:26:00Z">
+              <w:rPr>
+                <w:rFonts w:cstheme="minorHAnsi"/>
+                <w:bCs/>
+              </w:rPr>
+            </w:rPrChange>
+          </w:rPr>
+          <w:t>SEER/SEER2</w:t>
+        </w:r>
+      </w:ins>
+    </w:p>
+    <w:p>
+      <w:pPr>
+        <w:numPr>
+          <w:ilvl w:val="0"/>
+          <w:numId w:val="22"/>
+        </w:numPr>
+        <w:spacing w:after="0"/>
+        <w:rPr>
+          <w:ins w:id="62" w:author="Shewmaker, Michael@Energy" w:date="2022-12-19T08:26:00Z"/>
+          <w:rFonts w:cstheme="minorHAnsi"/>
+          <w:bCs/>
+        </w:rPr>
+      </w:pPr>
+      <w:ins w:id="63" w:author="Shewmaker, Michael@Energy" w:date="2022-12-19T08:26:00Z">
+        <w:r>
+          <w:rPr>
+            <w:rFonts w:cstheme="minorHAnsi"/>
+            <w:bCs/>
+          </w:rPr>
+          <w:t>E04b – added new field</w:t>
+        </w:r>
+      </w:ins>
+    </w:p>
+    <w:p>
+      <w:pPr>
+        <w:numPr>
+          <w:ilvl w:val="1"/>
+          <w:numId w:val="22"/>
+        </w:numPr>
+        <w:spacing w:after="0"/>
+        <w:rPr>
+          <w:rFonts w:cstheme="minorHAnsi"/>
+          <w:bCs/>
+        </w:rPr>
+      </w:pPr>
+      <w:ins w:id="64" w:author="Shewmaker, Michael@Energy" w:date="2022-12-19T08:26:00Z">
+        <w:r>
+          <w:rPr>
+            <w:rFonts w:cstheme="minorHAnsi"/>
+            <w:bCs/>
+          </w:rPr>
+          <w:t>Cooling Efficiency Value EER/EER2/CEER</w:t>
+        </w:r>
+      </w:ins>
+    </w:p>
+    <w:bookmarkEnd w:id="55"/>
     <w:p>
       <w:pPr>
         <w:spacing w:after="0"/>
@@ -1580,15 +2158,7 @@
         <w:t>H</w:t>
       </w:r>
       <w:r>
-        <w:t xml:space="preserve"> – </w:t>
-      </w:r>
-      <w:proofErr w:type="spellStart"/>
-      <w:r>
-        <w:t>CalculationsAndRules</w:t>
-      </w:r>
-      <w:proofErr w:type="spellEnd"/>
-      <w:r>
-        <w:t xml:space="preserve"> </w:t>
+        <w:t xml:space="preserve"> – CalculationsAndRules </w:t>
       </w:r>
       <w:r>
         <w:t xml:space="preserve">– </w:t>
@@ -2050,7 +2620,7 @@
         </w:rPr>
         <w:t>EER/SEER</w:t>
       </w:r>
-      <w:bookmarkStart w:id="10" w:name="_Hlk114849634"/>
+      <w:bookmarkStart w:id="65" w:name="_Hlk114849634"/>
       <w:r>
         <w:rPr>
           <w:rFonts w:cstheme="minorHAnsi"/>
@@ -2089,7 +2659,7 @@
         </w:rPr>
         <w:t>2/EER2</w:t>
       </w:r>
-      <w:bookmarkEnd w:id="10"/>
+      <w:bookmarkEnd w:id="65"/>
     </w:p>
     <w:p>
       <w:pPr>
@@ -2417,6 +2987,7 @@
           <w:rFonts w:cstheme="minorHAnsi"/>
           <w:b/>
         </w:rPr>
+        <w:lastRenderedPageBreak/>
         <w:t>EER/SEER</w:t>
       </w:r>
       <w:r>
@@ -2604,11 +3175,11 @@
         </w:numPr>
         <w:spacing w:after="0"/>
         <w:rPr>
-          <w:ins w:id="11" w:author="Shewmaker, Michael@Energy" w:date="2022-11-03T22:56:00Z"/>
+          <w:ins w:id="66" w:author="Shewmaker, Michael@Energy" w:date="2022-11-03T22:56:00Z"/>
           <w:rFonts w:asciiTheme="minorEastAsia" w:eastAsiaTheme="minorEastAsia" w:hAnsiTheme="minorEastAsia" w:cstheme="minorEastAsia"/>
         </w:rPr>
       </w:pPr>
-      <w:ins w:id="12" w:author="Shewmaker, Michael@Energy" w:date="2022-11-03T22:56:00Z">
+      <w:ins w:id="67" w:author="Shewmaker, Michael@Energy" w:date="2022-11-03T22:56:00Z">
         <w:r>
           <w:rPr>
             <w:rFonts w:eastAsiaTheme="minorEastAsia"/>
@@ -2626,14 +3197,14 @@
         </w:numPr>
         <w:spacing w:after="0"/>
         <w:rPr>
-          <w:ins w:id="13" w:author="Shewmaker, Michael@Energy" w:date="2022-11-03T22:56:00Z"/>
+          <w:ins w:id="68" w:author="Shewmaker, Michael@Energy" w:date="2022-11-03T22:56:00Z"/>
           <w:rFonts w:asciiTheme="minorEastAsia" w:eastAsiaTheme="minorEastAsia" w:hAnsiTheme="minorEastAsia" w:cstheme="minorEastAsia"/>
           <w:b/>
           <w:bCs/>
           <w:u w:val="single"/>
         </w:rPr>
       </w:pPr>
-      <w:ins w:id="14" w:author="Shewmaker, Michael@Energy" w:date="2022-11-03T22:56:00Z">
+      <w:ins w:id="69" w:author="Shewmaker, Michael@Energy" w:date="2022-11-03T22:56:00Z">
         <w:r>
           <w:rPr>
             <w:rFonts w:eastAsiaTheme="minorEastAsia"/>
@@ -2660,11 +3231,11 @@
         </w:numPr>
         <w:spacing w:after="0"/>
         <w:rPr>
-          <w:ins w:id="15" w:author="Shewmaker, Michael@Energy" w:date="2022-11-03T22:56:00Z"/>
+          <w:ins w:id="70" w:author="Shewmaker, Michael@Energy" w:date="2022-11-03T22:56:00Z"/>
           <w:rFonts w:asciiTheme="minorEastAsia" w:eastAsiaTheme="minorEastAsia" w:hAnsiTheme="minorEastAsia" w:cstheme="minorEastAsia"/>
         </w:rPr>
       </w:pPr>
-      <w:ins w:id="16" w:author="Shewmaker, Michael@Energy" w:date="2022-11-03T22:56:00Z">
+      <w:ins w:id="71" w:author="Shewmaker, Michael@Energy" w:date="2022-11-03T22:56:00Z">
         <w:r>
           <w:rPr>
             <w:rFonts w:eastAsiaTheme="minorEastAsia"/>
@@ -2682,12 +3253,12 @@
         </w:numPr>
         <w:spacing w:after="0"/>
         <w:rPr>
-          <w:ins w:id="17" w:author="Shewmaker, Michael@Energy" w:date="2022-11-03T22:56:00Z"/>
+          <w:ins w:id="72" w:author="Shewmaker, Michael@Energy" w:date="2022-11-03T22:56:00Z"/>
           <w:rFonts w:eastAsiaTheme="minorEastAsia"/>
           <w:color w:val="000000" w:themeColor="text1"/>
         </w:rPr>
       </w:pPr>
-      <w:ins w:id="18" w:author="Shewmaker, Michael@Energy" w:date="2022-11-03T22:56:00Z">
+      <w:ins w:id="73" w:author="Shewmaker, Michael@Energy" w:date="2022-11-03T22:56:00Z">
         <w:r>
           <w:t xml:space="preserve">MCH-01 = </w:t>
         </w:r>
@@ -2801,11 +3372,11 @@
         </w:numPr>
         <w:spacing w:after="0"/>
         <w:rPr>
-          <w:ins w:id="19" w:author="Shewmaker, Michael@Energy" w:date="2022-11-03T22:57:00Z"/>
+          <w:ins w:id="74" w:author="Shewmaker, Michael@Energy" w:date="2022-11-03T22:57:00Z"/>
           <w:rFonts w:asciiTheme="minorEastAsia" w:eastAsiaTheme="minorEastAsia" w:hAnsiTheme="minorEastAsia" w:cstheme="minorEastAsia"/>
         </w:rPr>
       </w:pPr>
-      <w:ins w:id="20" w:author="Shewmaker, Michael@Energy" w:date="2022-11-03T22:57:00Z">
+      <w:ins w:id="75" w:author="Shewmaker, Michael@Energy" w:date="2022-11-03T22:57:00Z">
         <w:r>
           <w:rPr>
             <w:rFonts w:eastAsiaTheme="minorEastAsia"/>
@@ -2823,14 +3394,14 @@
         </w:numPr>
         <w:spacing w:after="0"/>
         <w:rPr>
-          <w:ins w:id="21" w:author="Shewmaker, Michael@Energy" w:date="2022-11-03T22:57:00Z"/>
+          <w:ins w:id="76" w:author="Shewmaker, Michael@Energy" w:date="2022-11-03T22:57:00Z"/>
           <w:rFonts w:asciiTheme="minorEastAsia" w:eastAsiaTheme="minorEastAsia" w:hAnsiTheme="minorEastAsia" w:cstheme="minorEastAsia"/>
           <w:b/>
           <w:bCs/>
           <w:u w:val="single"/>
         </w:rPr>
       </w:pPr>
-      <w:ins w:id="22" w:author="Shewmaker, Michael@Energy" w:date="2022-11-03T22:57:00Z">
+      <w:ins w:id="77" w:author="Shewmaker, Michael@Energy" w:date="2022-11-03T22:57:00Z">
         <w:r>
           <w:rPr>
             <w:rFonts w:eastAsiaTheme="minorEastAsia"/>
@@ -2857,11 +3428,11 @@
         </w:numPr>
         <w:spacing w:after="0"/>
         <w:rPr>
-          <w:ins w:id="23" w:author="Shewmaker, Michael@Energy" w:date="2022-11-03T22:57:00Z"/>
+          <w:ins w:id="78" w:author="Shewmaker, Michael@Energy" w:date="2022-11-03T22:57:00Z"/>
           <w:rFonts w:asciiTheme="minorEastAsia" w:eastAsiaTheme="minorEastAsia" w:hAnsiTheme="minorEastAsia" w:cstheme="minorEastAsia"/>
         </w:rPr>
       </w:pPr>
-      <w:ins w:id="24" w:author="Shewmaker, Michael@Energy" w:date="2022-11-03T22:57:00Z">
+      <w:ins w:id="79" w:author="Shewmaker, Michael@Energy" w:date="2022-11-03T22:57:00Z">
         <w:r>
           <w:rPr>
             <w:rFonts w:eastAsiaTheme="minorEastAsia"/>
@@ -2879,12 +3450,12 @@
         </w:numPr>
         <w:spacing w:after="0"/>
         <w:rPr>
-          <w:ins w:id="25" w:author="Shewmaker, Michael@Energy" w:date="2022-11-03T22:57:00Z"/>
+          <w:ins w:id="80" w:author="Shewmaker, Michael@Energy" w:date="2022-11-03T22:57:00Z"/>
           <w:rFonts w:eastAsiaTheme="minorEastAsia"/>
           <w:color w:val="000000" w:themeColor="text1"/>
         </w:rPr>
       </w:pPr>
-      <w:ins w:id="26" w:author="Shewmaker, Michael@Energy" w:date="2022-11-03T22:57:00Z">
+      <w:ins w:id="81" w:author="Shewmaker, Michael@Energy" w:date="2022-11-03T22:57:00Z">
         <w:r>
           <w:t xml:space="preserve">MCH-01 = </w:t>
         </w:r>
@@ -3537,8 +4108,8 @@
           <w:u w:val="single"/>
         </w:rPr>
       </w:pPr>
-      <w:bookmarkStart w:id="27" w:name="_Hlk106724283"/>
-      <w:bookmarkStart w:id="28" w:name="_Hlk106724333"/>
+      <w:bookmarkStart w:id="82" w:name="_Hlk106724283"/>
+      <w:bookmarkStart w:id="83" w:name="_Hlk106724333"/>
       <w:r>
         <w:rPr>
           <w:rFonts w:cstheme="minorHAnsi"/>
@@ -3564,7 +4135,7 @@
         <w:t>CF3R-MCH-25e</w:t>
       </w:r>
     </w:p>
-    <w:bookmarkEnd w:id="27"/>
+    <w:bookmarkEnd w:id="82"/>
     <w:p>
       <w:pPr>
         <w:pStyle w:val="ListParagraph"/>
@@ -3620,7 +4191,7 @@
         <w:t xml:space="preserve">from compliance documents </w:t>
       </w:r>
     </w:p>
-    <w:bookmarkEnd w:id="28"/>
+    <w:bookmarkEnd w:id="83"/>
     <w:p>
       <w:pPr>
         <w:spacing w:after="0"/>
@@ -3783,12 +4354,12 @@
       <w:pPr>
         <w:spacing w:after="0"/>
         <w:rPr>
-          <w:del w:id="29" w:author="Alhabibi, Haider@Energy" w:date="2022-10-05T12:02:00Z"/>
+          <w:del w:id="84" w:author="Alhabibi, Haider@Energy" w:date="2022-10-05T12:02:00Z"/>
           <w:rFonts w:cstheme="minorHAnsi"/>
           <w:u w:val="single"/>
         </w:rPr>
       </w:pPr>
-      <w:del w:id="30" w:author="Alhabibi, Haider@Energy" w:date="2022-10-05T12:02:00Z">
+      <w:del w:id="85" w:author="Alhabibi, Haider@Energy" w:date="2022-10-05T12:02:00Z">
         <w:r>
           <w:rPr>
             <w:rFonts w:cstheme="minorHAnsi"/>
@@ -3807,14 +4378,14 @@
         </w:numPr>
         <w:spacing w:after="0"/>
         <w:rPr>
-          <w:del w:id="31" w:author="Alhabibi, Haider@Energy" w:date="2022-10-05T12:02:00Z"/>
+          <w:del w:id="86" w:author="Alhabibi, Haider@Energy" w:date="2022-10-05T12:02:00Z"/>
           <w:rFonts w:eastAsiaTheme="minorEastAsia"/>
           <w:color w:val="24292F"/>
           <w:sz w:val="21"/>
           <w:szCs w:val="21"/>
         </w:rPr>
       </w:pPr>
-      <w:del w:id="32" w:author="Alhabibi, Haider@Energy" w:date="2022-10-05T12:02:00Z">
+      <w:del w:id="87" w:author="Alhabibi, Haider@Energy" w:date="2022-10-05T12:02:00Z">
         <w:r>
           <w:rPr>
             <w:rFonts w:eastAsiaTheme="minorEastAsia"/>
@@ -3972,10 +4543,10 @@
           <w:rFonts w:eastAsia="Times New Roman" w:cstheme="minorHAnsi"/>
         </w:rPr>
       </w:pPr>
-      <w:bookmarkStart w:id="33" w:name="_Hlk106704024"/>
-      <w:bookmarkStart w:id="34" w:name="_Hlk106641517"/>
-      <w:bookmarkEnd w:id="33"/>
-      <w:bookmarkEnd w:id="34"/>
+      <w:bookmarkStart w:id="88" w:name="_Hlk106704024"/>
+      <w:bookmarkStart w:id="89" w:name="_Hlk106641517"/>
+      <w:bookmarkEnd w:id="88"/>
+      <w:bookmarkEnd w:id="89"/>
       <w:r>
         <w:rPr>
           <w:rFonts w:eastAsia="Times New Roman" w:cstheme="minorHAnsi"/>
@@ -3990,7 +4561,7 @@
           <w:u w:val="single"/>
         </w:rPr>
       </w:pPr>
-      <w:bookmarkStart w:id="35" w:name="_Hlk106721853"/>
+      <w:bookmarkStart w:id="90" w:name="_Hlk106721853"/>
       <w:r>
         <w:rPr>
           <w:u w:val="single"/>
@@ -4298,7 +4869,7 @@
         <w:t>CF2R-MCH-32</w:t>
       </w:r>
     </w:p>
-    <w:bookmarkEnd w:id="35"/>
+    <w:bookmarkEnd w:id="90"/>
     <w:p>
       <w:pPr>
         <w:pStyle w:val="ListParagraph"/>
@@ -4324,7 +4895,7 @@
         </w:numPr>
         <w:spacing w:after="0"/>
         <w:rPr>
-          <w:ins w:id="36" w:author="Shewmaker, Michael@Energy" w:date="2022-10-13T21:20:00Z"/>
+          <w:ins w:id="91" w:author="Shewmaker, Michael@Energy" w:date="2022-10-13T21:20:00Z"/>
           <w:rFonts w:eastAsiaTheme="minorEastAsia"/>
         </w:rPr>
       </w:pPr>
@@ -4347,7 +4918,7 @@
         </w:numPr>
         <w:spacing w:after="0"/>
       </w:pPr>
-      <w:ins w:id="37" w:author="Shewmaker, Michael@Energy" w:date="2022-10-13T21:20:00Z">
+      <w:ins w:id="92" w:author="Shewmaker, Michael@Energy" w:date="2022-10-13T21:20:00Z">
         <w:r>
           <w:rPr>
             <w:b/>
@@ -4409,6 +4980,7 @@
           <w:color w:val="000000"/>
           <w:bdr w:val="none" w:sz="0" w:space="0" w:color="auto" w:frame="1"/>
         </w:rPr>
+        <w:lastRenderedPageBreak/>
         <w:t>field A02 - update pseudo code; remove multifamily option</w:t>
       </w:r>
     </w:p>
@@ -4528,7 +5100,7 @@
         </w:numPr>
         <w:spacing w:after="0"/>
         <w:rPr>
-          <w:ins w:id="38" w:author="Shewmaker, Michael@Energy" w:date="2022-10-13T21:20:00Z"/>
+          <w:ins w:id="93" w:author="Shewmaker, Michael@Energy" w:date="2022-10-13T21:20:00Z"/>
           <w:rFonts w:eastAsiaTheme="minorEastAsia"/>
         </w:rPr>
       </w:pPr>
@@ -4552,7 +5124,7 @@
         </w:numPr>
         <w:spacing w:after="0"/>
       </w:pPr>
-      <w:ins w:id="39" w:author="Shewmaker, Michael@Energy" w:date="2022-10-13T21:20:00Z">
+      <w:ins w:id="94" w:author="Shewmaker, Michael@Energy" w:date="2022-10-13T21:20:00Z">
         <w:r>
           <w:rPr>
             <w:b/>
@@ -4673,7 +5245,6 @@
         <w:rPr>
           <w:color w:val="000000" w:themeColor="text1"/>
         </w:rPr>
-        <w:lastRenderedPageBreak/>
         <w:t>field A02 - update pseudo code; remove multifamily option</w:t>
       </w:r>
     </w:p>
@@ -4824,8 +5395,8 @@
           <w:rFonts w:cstheme="minorHAnsi"/>
         </w:rPr>
       </w:pPr>
-      <w:bookmarkStart w:id="40" w:name="_Hlk106721884"/>
-      <w:bookmarkEnd w:id="40"/>
+      <w:bookmarkStart w:id="95" w:name="_Hlk106721884"/>
+      <w:bookmarkEnd w:id="95"/>
     </w:p>
     <w:p>
       <w:pPr>
@@ -5335,6 +5906,7 @@
         <w:spacing w:after="0"/>
       </w:pPr>
       <w:r>
+        <w:lastRenderedPageBreak/>
         <w:t>A2.08 – revised pseudo code</w:t>
       </w:r>
     </w:p>
@@ -5565,7 +6137,6 @@
           <w:rStyle w:val="normaltextrun"/>
           <w:color w:val="000000" w:themeColor="text1"/>
         </w:rPr>
-        <w:lastRenderedPageBreak/>
         <w:t xml:space="preserve">A09 – Removed </w:t>
       </w:r>
     </w:p>
@@ -6084,11 +6655,9 @@
       <w:r>
         <w:t>Section B – revised pseudo code (</w:t>
       </w:r>
-      <w:proofErr w:type="spellStart"/>
       <w:r>
         <w:t>CalculationsAndRules</w:t>
       </w:r>
-      <w:proofErr w:type="spellEnd"/>
       <w:r>
         <w:t>)</w:t>
       </w:r>
@@ -6101,11 +6670,9 @@
       <w:r>
         <w:t>Section C – revised pseudo code (</w:t>
       </w:r>
-      <w:proofErr w:type="spellStart"/>
       <w:r>
         <w:t>CalculationsAndRules</w:t>
       </w:r>
-      <w:proofErr w:type="spellEnd"/>
       <w:r>
         <w:t>)</w:t>
       </w:r>
@@ -6126,7 +6693,7 @@
           <w:bCs/>
         </w:rPr>
       </w:pPr>
-      <w:bookmarkStart w:id="41" w:name="_Hlk114742586"/>
+      <w:bookmarkStart w:id="96" w:name="_Hlk114742586"/>
       <w:r>
         <w:t xml:space="preserve">reject deletion of </w:t>
       </w:r>
@@ -6195,7 +6762,7 @@
         <w:t>”</w:t>
       </w:r>
     </w:p>
-    <w:bookmarkEnd w:id="41"/>
+    <w:bookmarkEnd w:id="96"/>
     <w:p>
       <w:pPr>
         <w:spacing w:after="0"/>
@@ -6204,11 +6771,9 @@
       <w:r>
         <w:t>Section D – revised pseudo code (</w:t>
       </w:r>
-      <w:proofErr w:type="spellStart"/>
       <w:r>
         <w:t>CalculationsAndRules</w:t>
       </w:r>
-      <w:proofErr w:type="spellEnd"/>
       <w:r>
         <w:t>)</w:t>
       </w:r>
@@ -6283,11 +6848,9 @@
       <w:r>
         <w:t>Section E – revised pseudo code (</w:t>
       </w:r>
-      <w:proofErr w:type="spellStart"/>
       <w:r>
         <w:t>CalculationsAndRules</w:t>
       </w:r>
-      <w:proofErr w:type="spellEnd"/>
       <w:r>
         <w:t>)</w:t>
       </w:r>
@@ -6305,6 +6868,7 @@
         </w:rPr>
       </w:pPr>
       <w:r>
+        <w:lastRenderedPageBreak/>
         <w:t xml:space="preserve">reject deletion of </w:t>
       </w:r>
       <w:r>
@@ -6536,7 +7100,7 @@
       <w:pPr>
         <w:spacing w:after="0"/>
         <w:rPr>
-          <w:ins w:id="42" w:author="Alhabibi, Haider@Energy" w:date="2022-10-05T09:59:00Z"/>
+          <w:ins w:id="97" w:author="Alhabibi, Haider@Energy" w:date="2022-10-05T09:59:00Z"/>
           <w:u w:val="single"/>
         </w:rPr>
       </w:pPr>
@@ -6562,13 +7126,13 @@
         </w:numPr>
         <w:spacing w:after="0"/>
         <w:rPr>
-          <w:ins w:id="43" w:author="Alhabibi, Haider@Energy" w:date="2022-10-05T10:08:00Z"/>
+          <w:ins w:id="98" w:author="Alhabibi, Haider@Energy" w:date="2022-10-05T10:08:00Z"/>
           <w:b/>
           <w:bCs/>
           <w:u w:val="single"/>
         </w:rPr>
       </w:pPr>
-      <w:ins w:id="44" w:author="Alhabibi, Haider@Energy" w:date="2022-10-05T10:00:00Z">
+      <w:ins w:id="99" w:author="Alhabibi, Haider@Energy" w:date="2022-10-05T10:00:00Z">
         <w:r>
           <w:rPr>
             <w:b/>
@@ -6578,7 +7142,7 @@
           <w:t>A</w:t>
         </w:r>
       </w:ins>
-      <w:ins w:id="45" w:author="Alhabibi, Haider@Energy" w:date="2022-10-05T10:07:00Z">
+      <w:ins w:id="100" w:author="Alhabibi, Haider@Energy" w:date="2022-10-05T10:07:00Z">
         <w:r>
           <w:rPr>
             <w:b/>
@@ -6596,7 +7160,7 @@
           <w:t xml:space="preserve"> </w:t>
         </w:r>
       </w:ins>
-      <w:ins w:id="46" w:author="Alhabibi, Haider@Energy" w:date="2022-10-05T10:08:00Z">
+      <w:ins w:id="101" w:author="Alhabibi, Haider@Energy" w:date="2022-10-05T10:08:00Z">
         <w:r>
           <w:rPr>
             <w:b/>
@@ -6606,7 +7170,7 @@
           <w:t>–</w:t>
         </w:r>
       </w:ins>
-      <w:ins w:id="47" w:author="Alhabibi, Haider@Energy" w:date="2022-10-05T10:07:00Z">
+      <w:ins w:id="102" w:author="Alhabibi, Haider@Energy" w:date="2022-10-05T10:07:00Z">
         <w:r>
           <w:rPr>
             <w:b/>
@@ -6624,7 +7188,7 @@
           <w:t>r</w:t>
         </w:r>
       </w:ins>
-      <w:ins w:id="48" w:author="Alhabibi, Haider@Energy" w:date="2022-10-05T10:08:00Z">
+      <w:ins w:id="103" w:author="Alhabibi, Haider@Energy" w:date="2022-10-05T10:08:00Z">
         <w:r>
           <w:rPr>
             <w:b/>
@@ -6668,13 +7232,13 @@
         </w:numPr>
         <w:spacing w:after="0"/>
         <w:rPr>
-          <w:ins w:id="49" w:author="Alhabibi, Haider@Energy" w:date="2022-10-05T10:09:00Z"/>
+          <w:ins w:id="104" w:author="Alhabibi, Haider@Energy" w:date="2022-10-05T10:09:00Z"/>
           <w:b/>
           <w:bCs/>
           <w:u w:val="single"/>
         </w:rPr>
       </w:pPr>
-      <w:ins w:id="50" w:author="Alhabibi, Haider@Energy" w:date="2022-10-05T10:08:00Z">
+      <w:ins w:id="105" w:author="Alhabibi, Haider@Energy" w:date="2022-10-05T10:08:00Z">
         <w:r>
           <w:rPr>
             <w:b/>
@@ -6684,7 +7248,7 @@
           <w:t xml:space="preserve">add </w:t>
         </w:r>
       </w:ins>
-      <w:ins w:id="51" w:author="Alhabibi, Haider@Energy" w:date="2022-10-05T10:09:00Z">
+      <w:ins w:id="106" w:author="Alhabibi, Haider@Energy" w:date="2022-10-05T10:09:00Z">
         <w:r>
           <w:rPr>
             <w:b/>
@@ -6711,13 +7275,13 @@
           <w:numId w:val="22"/>
         </w:numPr>
         <w:rPr>
-          <w:ins w:id="52" w:author="Alhabibi, Haider@Energy" w:date="2022-10-05T10:09:00Z"/>
+          <w:ins w:id="107" w:author="Alhabibi, Haider@Energy" w:date="2022-10-05T10:09:00Z"/>
           <w:b/>
           <w:bCs/>
           <w:u w:val="single"/>
         </w:rPr>
       </w:pPr>
-      <w:ins w:id="53" w:author="Alhabibi, Haider@Energy" w:date="2022-10-05T10:09:00Z">
+      <w:ins w:id="108" w:author="Alhabibi, Haider@Energy" w:date="2022-10-05T10:09:00Z">
         <w:r>
           <w:rPr>
             <w:b/>
@@ -6727,7 +7291,7 @@
           <w:t>A0</w:t>
         </w:r>
       </w:ins>
-      <w:ins w:id="54" w:author="Alhabibi, Haider@Energy" w:date="2022-10-05T10:10:00Z">
+      <w:ins w:id="109" w:author="Alhabibi, Haider@Energy" w:date="2022-10-05T10:10:00Z">
         <w:r>
           <w:rPr>
             <w:b/>
@@ -6737,7 +7301,7 @@
           <w:t>8</w:t>
         </w:r>
       </w:ins>
-      <w:ins w:id="55" w:author="Alhabibi, Haider@Energy" w:date="2022-10-05T10:09:00Z">
+      <w:ins w:id="110" w:author="Alhabibi, Haider@Energy" w:date="2022-10-05T10:09:00Z">
         <w:r>
           <w:rPr>
             <w:b/>
@@ -6756,20 +7320,19 @@
           <w:numId w:val="22"/>
         </w:numPr>
         <w:rPr>
-          <w:ins w:id="56" w:author="Alhabibi, Haider@Energy" w:date="2022-10-05T10:09:00Z"/>
+          <w:ins w:id="111" w:author="Alhabibi, Haider@Energy" w:date="2022-10-05T10:09:00Z"/>
           <w:b/>
           <w:bCs/>
           <w:u w:val="single"/>
         </w:rPr>
       </w:pPr>
-      <w:ins w:id="57" w:author="Alhabibi, Haider@Energy" w:date="2022-10-05T10:09:00Z">
+      <w:ins w:id="112" w:author="Alhabibi, Haider@Energy" w:date="2022-10-05T10:09:00Z">
         <w:r>
           <w:rPr>
             <w:b/>
             <w:bCs/>
             <w:u w:val="single"/>
           </w:rPr>
-          <w:lastRenderedPageBreak/>
           <w:t>add N/A if OG-300</w:t>
         </w:r>
       </w:ins>
@@ -6783,8 +7346,8 @@
         </w:numPr>
         <w:spacing w:after="0"/>
         <w:rPr>
-          <w:ins w:id="58" w:author="Shewmaker, Michael@Energy" w:date="2022-11-03T23:01:00Z"/>
-          <w:del w:id="59" w:author="Alhabibi, Haider@Energy" w:date="2022-10-04T21:51:00Z"/>
+          <w:ins w:id="113" w:author="Shewmaker, Michael@Energy" w:date="2022-11-03T23:01:00Z"/>
+          <w:del w:id="114" w:author="Alhabibi, Haider@Energy" w:date="2022-10-04T21:51:00Z"/>
           <w:strike/>
         </w:rPr>
       </w:pPr>
@@ -6806,7 +7369,7 @@
       <w:pPr>
         <w:spacing w:after="0"/>
         <w:rPr>
-          <w:del w:id="60" w:author="Alhabibi, Haider@Energy" w:date="2022-10-04T21:51:00Z"/>
+          <w:del w:id="115" w:author="Alhabibi, Haider@Energy" w:date="2022-10-04T21:51:00Z"/>
           <w:strike/>
         </w:rPr>
       </w:pPr>
@@ -6815,10 +7378,10 @@
       <w:pPr>
         <w:spacing w:after="0"/>
         <w:rPr>
-          <w:ins w:id="61" w:author="Shewmaker, Michael@Energy" w:date="2022-11-03T16:01:00Z"/>
-        </w:rPr>
-      </w:pPr>
-      <w:ins w:id="62" w:author="Shewmaker, Michael@Energy" w:date="2022-11-03T16:02:00Z">
+          <w:ins w:id="116" w:author="Shewmaker, Michael@Energy" w:date="2022-11-03T16:01:00Z"/>
+        </w:rPr>
+      </w:pPr>
+      <w:ins w:id="117" w:author="Shewmaker, Michael@Energy" w:date="2022-11-03T16:02:00Z">
         <w:r>
           <w:t>Update</w:t>
         </w:r>
@@ -12342,38 +12905,6 @@
 </file>
 
 <file path=customXml/item1.xml><?xml version="1.0" encoding="utf-8"?>
-<?mso-contentType ?>
-<FormTemplates xmlns="http://schemas.microsoft.com/sharepoint/v3/contenttype/forms">
-  <Display>DocumentLibraryForm</Display>
-  <Edit>DocumentLibraryForm</Edit>
-  <New>DocumentLibraryForm</New>
-</FormTemplates>
-</file>
-
-<file path=customXml/item2.xml><?xml version="1.0" encoding="utf-8"?>
-<p:properties xmlns:p="http://schemas.microsoft.com/office/2006/metadata/properties" xmlns:xsi="http://www.w3.org/2001/XMLSchema-instance" xmlns:pc="http://schemas.microsoft.com/office/infopath/2007/PartnerControls">
-  <documentManagement>
-    <b26d xmlns="785685f2-c2e1-4352-89aa-3faca8eaba52" xsi:nil="true"/>
-    <DateCCOReviewed xmlns="785685f2-c2e1-4352-89aa-3faca8eaba52" xsi:nil="true"/>
-    <oawc xmlns="785685f2-c2e1-4352-89aa-3faca8eaba52" xsi:nil="true"/>
-    <sipv xmlns="785685f2-c2e1-4352-89aa-3faca8eaba52" xsi:nil="true"/>
-    <_x0074_mv6 xmlns="785685f2-c2e1-4352-89aa-3faca8eaba52">
-      <UserInfo>
-        <DisplayName/>
-        <AccountId xsi:nil="true"/>
-        <AccountType/>
-      </UserInfo>
-    </_x0074_mv6>
-    <CCOReviewr xmlns="785685f2-c2e1-4352-89aa-3faca8eaba52" xsi:nil="true"/>
-    <TaxCatchAll xmlns="5067c814-4b34-462c-a21d-c185ff6548d2" xsi:nil="true"/>
-    <lcf76f155ced4ddcb4097134ff3c332f xmlns="785685f2-c2e1-4352-89aa-3faca8eaba52">
-      <Terms xmlns="http://schemas.microsoft.com/office/infopath/2007/PartnerControls"/>
-    </lcf76f155ced4ddcb4097134ff3c332f>
-  </documentManagement>
-</p:properties>
-</file>
-
-<file path=customXml/item3.xml><?xml version="1.0" encoding="utf-8"?>
 <ct:contentTypeSchema xmlns:ct="http://schemas.microsoft.com/office/2006/metadata/contentType" xmlns:ma="http://schemas.microsoft.com/office/2006/metadata/properties/metaAttributes" ct:_="" ma:_="" ma:contentTypeName="Document" ma:contentTypeID="0x01010061DC9A153AAEEE45BACE06E01F8272AC" ma:contentTypeVersion="20" ma:contentTypeDescription="Create a new document." ma:contentTypeScope="" ma:versionID="9666f44ab16ed15b00f463a1ceb948f7">
   <xsd:schema xmlns:xsd="http://www.w3.org/2001/XMLSchema" xmlns:xs="http://www.w3.org/2001/XMLSchema" xmlns:p="http://schemas.microsoft.com/office/2006/metadata/properties" xmlns:ns2="785685f2-c2e1-4352-89aa-3faca8eaba52" xmlns:ns3="5067c814-4b34-462c-a21d-c185ff6548d2" targetNamespace="http://schemas.microsoft.com/office/2006/metadata/properties" ma:root="true" ma:fieldsID="3613115c6c127afe4a56fd1236c892c2" ns2:_="" ns3:_="">
     <xsd:import namespace="785685f2-c2e1-4352-89aa-3faca8eaba52"/>
@@ -12656,32 +13187,39 @@
 </ct:contentTypeSchema>
 </file>
 
-<file path=customXml/itemProps1.xml><?xml version="1.0" encoding="utf-8"?>
-<ds:datastoreItem xmlns:ds="http://schemas.openxmlformats.org/officeDocument/2006/customXml" ds:itemID="{C2ACEDC3-F308-49C7-BAD3-031CABB1F749}">
-  <ds:schemaRefs>
-    <ds:schemaRef ds:uri="http://schemas.microsoft.com/sharepoint/v3/contenttype/forms"/>
-  </ds:schemaRefs>
-</ds:datastoreItem>
+<file path=customXml/item2.xml><?xml version="1.0" encoding="utf-8"?>
+<?mso-contentType ?>
+<FormTemplates xmlns="http://schemas.microsoft.com/sharepoint/v3/contenttype/forms">
+  <Display>DocumentLibraryForm</Display>
+  <Edit>DocumentLibraryForm</Edit>
+  <New>DocumentLibraryForm</New>
+</FormTemplates>
 </file>
 
-<file path=customXml/itemProps2.xml><?xml version="1.0" encoding="utf-8"?>
-<ds:datastoreItem xmlns:ds="http://schemas.openxmlformats.org/officeDocument/2006/customXml" ds:itemID="{A1BA62CE-C6C6-4272-9386-783347C3C7EF}">
-  <ds:schemaRefs>
-    <ds:schemaRef ds:uri="785685f2-c2e1-4352-89aa-3faca8eaba52"/>
-    <ds:schemaRef ds:uri="http://purl.org/dc/dcmitype/"/>
-    <ds:schemaRef ds:uri="5067c814-4b34-462c-a21d-c185ff6548d2"/>
-    <ds:schemaRef ds:uri="http://schemas.microsoft.com/office/infopath/2007/PartnerControls"/>
-    <ds:schemaRef ds:uri="http://schemas.openxmlformats.org/package/2006/metadata/core-properties"/>
-    <ds:schemaRef ds:uri="http://schemas.microsoft.com/office/2006/documentManagement/types"/>
-    <ds:schemaRef ds:uri="http://purl.org/dc/terms/"/>
-    <ds:schemaRef ds:uri="http://schemas.microsoft.com/office/2006/metadata/properties"/>
-    <ds:schemaRef ds:uri="http://www.w3.org/XML/1998/namespace"/>
-    <ds:schemaRef ds:uri="http://purl.org/dc/elements/1.1/"/>
-  </ds:schemaRefs>
-</ds:datastoreItem>
+<file path=customXml/item3.xml><?xml version="1.0" encoding="utf-8"?>
+<p:properties xmlns:p="http://schemas.microsoft.com/office/2006/metadata/properties" xmlns:xsi="http://www.w3.org/2001/XMLSchema-instance" xmlns:pc="http://schemas.microsoft.com/office/infopath/2007/PartnerControls">
+  <documentManagement>
+    <b26d xmlns="785685f2-c2e1-4352-89aa-3faca8eaba52" xsi:nil="true"/>
+    <DateCCOReviewed xmlns="785685f2-c2e1-4352-89aa-3faca8eaba52" xsi:nil="true"/>
+    <oawc xmlns="785685f2-c2e1-4352-89aa-3faca8eaba52" xsi:nil="true"/>
+    <sipv xmlns="785685f2-c2e1-4352-89aa-3faca8eaba52" xsi:nil="true"/>
+    <_x0074_mv6 xmlns="785685f2-c2e1-4352-89aa-3faca8eaba52">
+      <UserInfo>
+        <DisplayName/>
+        <AccountId xsi:nil="true"/>
+        <AccountType/>
+      </UserInfo>
+    </_x0074_mv6>
+    <CCOReviewr xmlns="785685f2-c2e1-4352-89aa-3faca8eaba52" xsi:nil="true"/>
+    <TaxCatchAll xmlns="5067c814-4b34-462c-a21d-c185ff6548d2" xsi:nil="true"/>
+    <lcf76f155ced4ddcb4097134ff3c332f xmlns="785685f2-c2e1-4352-89aa-3faca8eaba52">
+      <Terms xmlns="http://schemas.microsoft.com/office/infopath/2007/PartnerControls"/>
+    </lcf76f155ced4ddcb4097134ff3c332f>
+  </documentManagement>
+</p:properties>
 </file>
 
-<file path=customXml/itemProps3.xml><?xml version="1.0" encoding="utf-8"?>
+<file path=customXml/itemProps1.xml><?xml version="1.0" encoding="utf-8"?>
 <ds:datastoreItem xmlns:ds="http://schemas.openxmlformats.org/officeDocument/2006/customXml" ds:itemID="{195F94A6-9D9E-4CB3-92BB-D818B6536F53}">
   <ds:schemaRefs>
     <ds:schemaRef ds:uri="http://schemas.microsoft.com/office/2006/metadata/contentType"/>
@@ -12698,4 +13236,23 @@
     <ds:schemaRef ds:uri="http://schemas.microsoft.com/internal/obd"/>
   </ds:schemaRefs>
 </ds:datastoreItem>
+</file>
+
+<file path=customXml/itemProps2.xml><?xml version="1.0" encoding="utf-8"?>
+<ds:datastoreItem xmlns:ds="http://schemas.openxmlformats.org/officeDocument/2006/customXml" ds:itemID="{C2ACEDC3-F308-49C7-BAD3-031CABB1F749}">
+  <ds:schemaRefs>
+    <ds:schemaRef ds:uri="http://schemas.microsoft.com/sharepoint/v3/contenttype/forms"/>
+  </ds:schemaRefs>
+</ds:datastoreItem>
+</file>
+
+<file path=customXml/itemProps3.xml><?xml version="1.0" encoding="utf-8"?>
+<ds:datastoreItem xmlns:ds="http://schemas.openxmlformats.org/officeDocument/2006/customXml" ds:itemID="{A1BA62CE-C6C6-4272-9386-783347C3C7EF}">
+  <ds:schemaRefs>
+    <ds:schemaRef ds:uri="http://schemas.microsoft.com/office/2006/metadata/properties"/>
+    <ds:schemaRef ds:uri="http://schemas.microsoft.com/office/infopath/2007/PartnerControls"/>
+    <ds:schemaRef ds:uri="785685f2-c2e1-4352-89aa-3faca8eaba52"/>
+    <ds:schemaRef ds:uri="5067c814-4b34-462c-a21d-c185ff6548d2"/>
+  </ds:schemaRefs>
+</ds:datastoreItem>
 </file>
</xml_diff>